<commit_message>
fix: align example ADaM spec/datasets/shell, enforce IG 8-char names
Bring the bundled APX-DRM-301 example into full agreement across the
annotated shell, ADaM spec, and XPT datasets:

- Shell: ADSL.W16/W52/W140COMPFL -> COMPW16/COMPW52/COMPW140. The 9-char
  forms broke the ADaM IG 8-char limit and were unparseable by the
  package's .ADAM_VAR regex (silent annotation drop); spec/data already
  used COMPW##.
- Spec + datasets: rename non-conformant 9-char numeric companions
  AVALCAT1N->AVALCA1N, BASECAT1N->BASECA1N (ADEFF, ADVS),
  CMDOSFRQN->CMDOSFRN (ADCM), including codelist IDs and derivation prose.
  Column data preserved.

Result: every shell annotation resolves in both spec and dataset; no
variable exceeds 8 characters.

Co-Authored-By: Claude Opus 4.8 (1M context) <noreply@anthropic.com>
</commit_message>
<xml_diff>
--- a/inst/extdata/example_apx_drm_301/annotated_shell.docx
+++ b/inst/extdata/example_apx_drm_301/annotated_shell.docx
@@ -1785,14 +1785,14 @@
               <w:rPr>
                 <w:color w:val="C00000"/>
               </w:rPr>
-              <w:t>ADSL.W</w:t>
+              <w:t>ADSL.</w:t>
             </w:r>
             <w:proofErr w:type="gramEnd"/>
             <w:r>
               <w:rPr>
                 <w:color w:val="C00000"/>
               </w:rPr>
-              <w:t>16COMPFL='Y'</w:t>
+              <w:t>COMPW16='Y'</w:t>
             </w:r>
           </w:p>
         </w:tc>
@@ -1935,14 +1935,14 @@
               <w:rPr>
                 <w:color w:val="C00000"/>
               </w:rPr>
-              <w:t>ADSL.W</w:t>
+              <w:t>ADSL.</w:t>
             </w:r>
             <w:proofErr w:type="gramEnd"/>
             <w:r>
               <w:rPr>
                 <w:color w:val="C00000"/>
               </w:rPr>
-              <w:t>52COMPFL='Y'</w:t>
+              <w:t>COMPW52='Y'</w:t>
             </w:r>
           </w:p>
         </w:tc>
@@ -2085,14 +2085,14 @@
               <w:rPr>
                 <w:color w:val="C00000"/>
               </w:rPr>
-              <w:t>ADSL.W</w:t>
+              <w:t>ADSL.</w:t>
             </w:r>
             <w:proofErr w:type="gramEnd"/>
             <w:r>
               <w:rPr>
                 <w:color w:val="C00000"/>
               </w:rPr>
-              <w:t>140COMPFL='Y'</w:t>
+              <w:t>COMPW140='Y'</w:t>
             </w:r>
           </w:p>
         </w:tc>

</xml_diff>

<commit_message>
fix: remove empty crossover row/CROSSFL from example (shell, spec, data)
The Week-16 placebo crossover disposition row rendered n=0 in every arm
(no CROSSFL='Y' subjects in the synthetic data) and was already absent
from the inputs shell. Purge it everywhere so the inst shell matches:

- inst annotated shell: drop the "Crossed over from Placebo" table row.
- Both specs: delete the ADSL CROSSFL variable row.
- All ADSL datasets (inputs loose + both ADaM.zip): drop the CROSSFL column.

Annotation/spec/dataset alignment re-verified: no orphans, no >8-char
names, spec == dataset for both file sets.

Co-Authored-By: Claude Opus 4.8 (1M context) <noreply@anthropic.com>
</commit_message>
<xml_diff>
--- a/inst/extdata/example_apx_drm_301/annotated_shell.docx
+++ b/inst/extdata/example_apx_drm_301/annotated_shell.docx
@@ -1486,156 +1486,6 @@
                 <w:color w:val="C00000"/>
               </w:rPr>
               <w:t>ADSL.SAFFL</w:t>
-            </w:r>
-            <w:proofErr w:type="gramEnd"/>
-            <w:r>
-              <w:rPr>
-                <w:color w:val="C00000"/>
-              </w:rPr>
-              <w:t>='Y'</w:t>
-            </w:r>
-          </w:p>
-        </w:tc>
-        <w:tc>
-          <w:tcPr>
-            <w:tcW w:w="2340" w:type="dxa"/>
-            <w:tcBorders>
-              <w:top w:val="single" w:sz="4" w:space="0" w:color="808080"/>
-              <w:left w:val="single" w:sz="4" w:space="0" w:color="808080"/>
-              <w:bottom w:val="single" w:sz="4" w:space="0" w:color="808080"/>
-              <w:right w:val="single" w:sz="4" w:space="0" w:color="808080"/>
-            </w:tcBorders>
-            <w:tcMar>
-              <w:top w:w="60" w:type="dxa"/>
-              <w:left w:w="100" w:type="dxa"/>
-              <w:bottom w:w="60" w:type="dxa"/>
-              <w:right w:w="100" w:type="dxa"/>
-            </w:tcMar>
-            <w:vAlign w:val="center"/>
-          </w:tcPr>
-          <w:p>
-            <w:pPr>
-              <w:jc w:val="center"/>
-            </w:pPr>
-            <w:r>
-              <w:t>xxx (</w:t>
-            </w:r>
-            <w:proofErr w:type="spellStart"/>
-            <w:r>
-              <w:t>xx.x</w:t>
-            </w:r>
-            <w:proofErr w:type="spellEnd"/>
-            <w:r>
-              <w:t>)</w:t>
-            </w:r>
-          </w:p>
-        </w:tc>
-        <w:tc>
-          <w:tcPr>
-            <w:tcW w:w="2340" w:type="dxa"/>
-            <w:tcBorders>
-              <w:top w:val="single" w:sz="4" w:space="0" w:color="808080"/>
-              <w:left w:val="single" w:sz="4" w:space="0" w:color="808080"/>
-              <w:bottom w:val="single" w:sz="4" w:space="0" w:color="808080"/>
-              <w:right w:val="single" w:sz="4" w:space="0" w:color="808080"/>
-            </w:tcBorders>
-            <w:tcMar>
-              <w:top w:w="60" w:type="dxa"/>
-              <w:left w:w="100" w:type="dxa"/>
-              <w:bottom w:w="60" w:type="dxa"/>
-              <w:right w:w="100" w:type="dxa"/>
-            </w:tcMar>
-            <w:vAlign w:val="center"/>
-          </w:tcPr>
-          <w:p>
-            <w:pPr>
-              <w:jc w:val="center"/>
-            </w:pPr>
-            <w:r>
-              <w:t>xxx (</w:t>
-            </w:r>
-            <w:proofErr w:type="spellStart"/>
-            <w:r>
-              <w:t>xx.x</w:t>
-            </w:r>
-            <w:proofErr w:type="spellEnd"/>
-            <w:r>
-              <w:t>)</w:t>
-            </w:r>
-          </w:p>
-        </w:tc>
-        <w:tc>
-          <w:tcPr>
-            <w:tcW w:w="2340" w:type="dxa"/>
-            <w:tcBorders>
-              <w:top w:val="single" w:sz="4" w:space="0" w:color="808080"/>
-              <w:left w:val="single" w:sz="4" w:space="0" w:color="808080"/>
-              <w:bottom w:val="single" w:sz="4" w:space="0" w:color="808080"/>
-              <w:right w:val="single" w:sz="4" w:space="0" w:color="808080"/>
-            </w:tcBorders>
-            <w:tcMar>
-              <w:top w:w="60" w:type="dxa"/>
-              <w:left w:w="100" w:type="dxa"/>
-              <w:bottom w:w="60" w:type="dxa"/>
-              <w:right w:w="100" w:type="dxa"/>
-            </w:tcMar>
-            <w:vAlign w:val="center"/>
-          </w:tcPr>
-          <w:p>
-            <w:pPr>
-              <w:jc w:val="center"/>
-            </w:pPr>
-            <w:r>
-              <w:t>xxx (</w:t>
-            </w:r>
-            <w:proofErr w:type="spellStart"/>
-            <w:r>
-              <w:t>xx.x</w:t>
-            </w:r>
-            <w:proofErr w:type="spellEnd"/>
-            <w:r>
-              <w:t>)</w:t>
-            </w:r>
-          </w:p>
-        </w:tc>
-      </w:tr>
-      <w:tr>
-        <w:tblPrEx>
-          <w:tblCellMar>
-            <w:top w:w="0" w:type="dxa"/>
-            <w:bottom w:w="0" w:type="dxa"/>
-          </w:tblCellMar>
-        </w:tblPrEx>
-        <w:tc>
-          <w:tcPr>
-            <w:tcW w:w="4680" w:type="dxa"/>
-            <w:tcBorders>
-              <w:top w:val="single" w:sz="4" w:space="0" w:color="808080"/>
-              <w:left w:val="single" w:sz="4" w:space="0" w:color="808080"/>
-              <w:bottom w:val="single" w:sz="4" w:space="0" w:color="808080"/>
-              <w:right w:val="single" w:sz="4" w:space="0" w:color="808080"/>
-            </w:tcBorders>
-            <w:tcMar>
-              <w:top w:w="60" w:type="dxa"/>
-              <w:left w:w="100" w:type="dxa"/>
-              <w:bottom w:w="60" w:type="dxa"/>
-              <w:right w:w="100" w:type="dxa"/>
-            </w:tcMar>
-            <w:vAlign w:val="center"/>
-          </w:tcPr>
-          <w:p>
-            <w:r>
-              <w:t>Crossed over from Placebo at Week 16 (re-randomized 1:1 to UPA15 or UPA30</w:t>
-            </w:r>
-            <w:proofErr w:type="gramStart"/>
-            <w:r>
-              <w:t xml:space="preserve">)  </w:t>
-            </w:r>
-            <w:r>
-              <w:rPr>
-                <w:color w:val="C00000"/>
-              </w:rPr>
-              <w:t>ADSL.CROSSFL</w:t>
             </w:r>
             <w:proofErr w:type="gramEnd"/>
             <w:r>

</xml_diff>

<commit_message>
chore: sync example bundle shell -- drop ADCM.ADY by-visit rows from T_14_1_4
Bring the packaged example (inst/extdata) annotated shell in line with the
fixed inputs/ shell: remove the "Topical therapy use ... by visit  ADCM.ADY"
row and its Wk 4/16/52/104/140 sub-rows (ADCM.ADY is a numeric study day that
was being tabulated as raw categories). The app's "Load example" flow now gets
the corrected shell.

Co-Authored-By: Claude Opus 4.8 (1M context) <noreply@anthropic.com>
</commit_message>
<xml_diff>
--- a/inst/extdata/example_apx_drm_301/annotated_shell.docx
+++ b/inst/extdata/example_apx_drm_301/annotated_shell.docx
@@ -18123,863 +18123,6 @@
           <w:p>
             <w:r>
               <w:t>Did not receive any topical therapy</w:t>
-            </w:r>
-          </w:p>
-        </w:tc>
-        <w:tc>
-          <w:tcPr>
-            <w:tcW w:w="2340" w:type="dxa"/>
-            <w:tcBorders>
-              <w:top w:val="single" w:sz="4" w:space="0" w:color="808080"/>
-              <w:left w:val="single" w:sz="4" w:space="0" w:color="808080"/>
-              <w:bottom w:val="single" w:sz="4" w:space="0" w:color="808080"/>
-              <w:right w:val="single" w:sz="4" w:space="0" w:color="808080"/>
-            </w:tcBorders>
-            <w:tcMar>
-              <w:top w:w="60" w:type="dxa"/>
-              <w:left w:w="100" w:type="dxa"/>
-              <w:bottom w:w="60" w:type="dxa"/>
-              <w:right w:w="100" w:type="dxa"/>
-            </w:tcMar>
-            <w:vAlign w:val="center"/>
-          </w:tcPr>
-          <w:p>
-            <w:pPr>
-              <w:jc w:val="center"/>
-            </w:pPr>
-            <w:r>
-              <w:t>xxx (</w:t>
-            </w:r>
-            <w:proofErr w:type="spellStart"/>
-            <w:r>
-              <w:t>xx.x</w:t>
-            </w:r>
-            <w:proofErr w:type="spellEnd"/>
-            <w:r>
-              <w:t>)</w:t>
-            </w:r>
-          </w:p>
-        </w:tc>
-        <w:tc>
-          <w:tcPr>
-            <w:tcW w:w="2340" w:type="dxa"/>
-            <w:tcBorders>
-              <w:top w:val="single" w:sz="4" w:space="0" w:color="808080"/>
-              <w:left w:val="single" w:sz="4" w:space="0" w:color="808080"/>
-              <w:bottom w:val="single" w:sz="4" w:space="0" w:color="808080"/>
-              <w:right w:val="single" w:sz="4" w:space="0" w:color="808080"/>
-            </w:tcBorders>
-            <w:tcMar>
-              <w:top w:w="60" w:type="dxa"/>
-              <w:left w:w="100" w:type="dxa"/>
-              <w:bottom w:w="60" w:type="dxa"/>
-              <w:right w:w="100" w:type="dxa"/>
-            </w:tcMar>
-            <w:vAlign w:val="center"/>
-          </w:tcPr>
-          <w:p>
-            <w:pPr>
-              <w:jc w:val="center"/>
-            </w:pPr>
-            <w:r>
-              <w:t>xxx (</w:t>
-            </w:r>
-            <w:proofErr w:type="spellStart"/>
-            <w:r>
-              <w:t>xx.x</w:t>
-            </w:r>
-            <w:proofErr w:type="spellEnd"/>
-            <w:r>
-              <w:t>)</w:t>
-            </w:r>
-          </w:p>
-        </w:tc>
-        <w:tc>
-          <w:tcPr>
-            <w:tcW w:w="2340" w:type="dxa"/>
-            <w:tcBorders>
-              <w:top w:val="single" w:sz="4" w:space="0" w:color="808080"/>
-              <w:left w:val="single" w:sz="4" w:space="0" w:color="808080"/>
-              <w:bottom w:val="single" w:sz="4" w:space="0" w:color="808080"/>
-              <w:right w:val="single" w:sz="4" w:space="0" w:color="808080"/>
-            </w:tcBorders>
-            <w:tcMar>
-              <w:top w:w="60" w:type="dxa"/>
-              <w:left w:w="100" w:type="dxa"/>
-              <w:bottom w:w="60" w:type="dxa"/>
-              <w:right w:w="100" w:type="dxa"/>
-            </w:tcMar>
-            <w:vAlign w:val="center"/>
-          </w:tcPr>
-          <w:p>
-            <w:pPr>
-              <w:jc w:val="center"/>
-            </w:pPr>
-            <w:r>
-              <w:t>xxx (</w:t>
-            </w:r>
-            <w:proofErr w:type="spellStart"/>
-            <w:r>
-              <w:t>xx.x</w:t>
-            </w:r>
-            <w:proofErr w:type="spellEnd"/>
-            <w:r>
-              <w:t>)</w:t>
-            </w:r>
-          </w:p>
-        </w:tc>
-      </w:tr>
-      <w:tr>
-        <w:tblPrEx>
-          <w:tblCellMar>
-            <w:top w:w="0" w:type="dxa"/>
-            <w:bottom w:w="0" w:type="dxa"/>
-          </w:tblCellMar>
-        </w:tblPrEx>
-        <w:tc>
-          <w:tcPr>
-            <w:tcW w:w="4680" w:type="dxa"/>
-            <w:tcBorders>
-              <w:top w:val="single" w:sz="4" w:space="0" w:color="808080"/>
-              <w:left w:val="single" w:sz="4" w:space="0" w:color="808080"/>
-              <w:bottom w:val="single" w:sz="4" w:space="0" w:color="808080"/>
-              <w:right w:val="single" w:sz="4" w:space="0" w:color="808080"/>
-            </w:tcBorders>
-            <w:tcMar>
-              <w:top w:w="60" w:type="dxa"/>
-              <w:left w:w="100" w:type="dxa"/>
-              <w:bottom w:w="60" w:type="dxa"/>
-              <w:right w:w="100" w:type="dxa"/>
-            </w:tcMar>
-            <w:vAlign w:val="center"/>
-          </w:tcPr>
-          <w:p>
-            <w:r>
-              <w:t xml:space="preserve">Topical therapy </w:t>
-            </w:r>
-            <w:proofErr w:type="gramStart"/>
-            <w:r>
-              <w:t>use</w:t>
-            </w:r>
-            <w:proofErr w:type="gramEnd"/>
-            <w:r>
-              <w:t xml:space="preserve"> in 4 weeks prior to visit, by </w:t>
-            </w:r>
-            <w:proofErr w:type="gramStart"/>
-            <w:r>
-              <w:t xml:space="preserve">visit  </w:t>
-            </w:r>
-            <w:r>
-              <w:rPr>
-                <w:color w:val="C00000"/>
-              </w:rPr>
-              <w:t>ADCM.ADY</w:t>
-            </w:r>
-            <w:proofErr w:type="gramEnd"/>
-          </w:p>
-        </w:tc>
-        <w:tc>
-          <w:tcPr>
-            <w:tcW w:w="2340" w:type="dxa"/>
-            <w:tcBorders>
-              <w:top w:val="single" w:sz="4" w:space="0" w:color="808080"/>
-              <w:left w:val="single" w:sz="4" w:space="0" w:color="808080"/>
-              <w:bottom w:val="single" w:sz="4" w:space="0" w:color="808080"/>
-              <w:right w:val="single" w:sz="4" w:space="0" w:color="808080"/>
-            </w:tcBorders>
-            <w:tcMar>
-              <w:top w:w="60" w:type="dxa"/>
-              <w:left w:w="100" w:type="dxa"/>
-              <w:bottom w:w="60" w:type="dxa"/>
-              <w:right w:w="100" w:type="dxa"/>
-            </w:tcMar>
-            <w:vAlign w:val="center"/>
-          </w:tcPr>
-          <w:p>
-            <w:pPr>
-              <w:jc w:val="center"/>
-            </w:pPr>
-            <w:r>
-              <w:t>xxx (</w:t>
-            </w:r>
-            <w:proofErr w:type="spellStart"/>
-            <w:r>
-              <w:t>xx.x</w:t>
-            </w:r>
-            <w:proofErr w:type="spellEnd"/>
-            <w:r>
-              <w:t>)</w:t>
-            </w:r>
-          </w:p>
-        </w:tc>
-        <w:tc>
-          <w:tcPr>
-            <w:tcW w:w="2340" w:type="dxa"/>
-            <w:tcBorders>
-              <w:top w:val="single" w:sz="4" w:space="0" w:color="808080"/>
-              <w:left w:val="single" w:sz="4" w:space="0" w:color="808080"/>
-              <w:bottom w:val="single" w:sz="4" w:space="0" w:color="808080"/>
-              <w:right w:val="single" w:sz="4" w:space="0" w:color="808080"/>
-            </w:tcBorders>
-            <w:tcMar>
-              <w:top w:w="60" w:type="dxa"/>
-              <w:left w:w="100" w:type="dxa"/>
-              <w:bottom w:w="60" w:type="dxa"/>
-              <w:right w:w="100" w:type="dxa"/>
-            </w:tcMar>
-            <w:vAlign w:val="center"/>
-          </w:tcPr>
-          <w:p>
-            <w:pPr>
-              <w:jc w:val="center"/>
-            </w:pPr>
-            <w:r>
-              <w:t>xxx (</w:t>
-            </w:r>
-            <w:proofErr w:type="spellStart"/>
-            <w:r>
-              <w:t>xx.x</w:t>
-            </w:r>
-            <w:proofErr w:type="spellEnd"/>
-            <w:r>
-              <w:t>)</w:t>
-            </w:r>
-          </w:p>
-        </w:tc>
-        <w:tc>
-          <w:tcPr>
-            <w:tcW w:w="2340" w:type="dxa"/>
-            <w:tcBorders>
-              <w:top w:val="single" w:sz="4" w:space="0" w:color="808080"/>
-              <w:left w:val="single" w:sz="4" w:space="0" w:color="808080"/>
-              <w:bottom w:val="single" w:sz="4" w:space="0" w:color="808080"/>
-              <w:right w:val="single" w:sz="4" w:space="0" w:color="808080"/>
-            </w:tcBorders>
-            <w:tcMar>
-              <w:top w:w="60" w:type="dxa"/>
-              <w:left w:w="100" w:type="dxa"/>
-              <w:bottom w:w="60" w:type="dxa"/>
-              <w:right w:w="100" w:type="dxa"/>
-            </w:tcMar>
-            <w:vAlign w:val="center"/>
-          </w:tcPr>
-          <w:p>
-            <w:pPr>
-              <w:jc w:val="center"/>
-            </w:pPr>
-            <w:r>
-              <w:t>xxx (</w:t>
-            </w:r>
-            <w:proofErr w:type="spellStart"/>
-            <w:r>
-              <w:t>xx.x</w:t>
-            </w:r>
-            <w:proofErr w:type="spellEnd"/>
-            <w:r>
-              <w:t>)</w:t>
-            </w:r>
-          </w:p>
-        </w:tc>
-      </w:tr>
-      <w:tr>
-        <w:tblPrEx>
-          <w:tblCellMar>
-            <w:top w:w="0" w:type="dxa"/>
-            <w:bottom w:w="0" w:type="dxa"/>
-          </w:tblCellMar>
-        </w:tblPrEx>
-        <w:tc>
-          <w:tcPr>
-            <w:tcW w:w="4680" w:type="dxa"/>
-            <w:tcBorders>
-              <w:top w:val="single" w:sz="4" w:space="0" w:color="808080"/>
-              <w:left w:val="single" w:sz="4" w:space="0" w:color="808080"/>
-              <w:bottom w:val="single" w:sz="4" w:space="0" w:color="808080"/>
-              <w:right w:val="single" w:sz="4" w:space="0" w:color="808080"/>
-            </w:tcBorders>
-            <w:tcMar>
-              <w:top w:w="60" w:type="dxa"/>
-              <w:left w:w="100" w:type="dxa"/>
-              <w:bottom w:w="60" w:type="dxa"/>
-              <w:right w:w="100" w:type="dxa"/>
-            </w:tcMar>
-            <w:vAlign w:val="center"/>
-          </w:tcPr>
-          <w:p>
-            <w:r>
-              <w:t xml:space="preserve">    </w:t>
-            </w:r>
-            <w:proofErr w:type="spellStart"/>
-            <w:r>
-              <w:t>Wk</w:t>
-            </w:r>
-            <w:proofErr w:type="spellEnd"/>
-            <w:r>
-              <w:t xml:space="preserve"> 4</w:t>
-            </w:r>
-          </w:p>
-        </w:tc>
-        <w:tc>
-          <w:tcPr>
-            <w:tcW w:w="2340" w:type="dxa"/>
-            <w:tcBorders>
-              <w:top w:val="single" w:sz="4" w:space="0" w:color="808080"/>
-              <w:left w:val="single" w:sz="4" w:space="0" w:color="808080"/>
-              <w:bottom w:val="single" w:sz="4" w:space="0" w:color="808080"/>
-              <w:right w:val="single" w:sz="4" w:space="0" w:color="808080"/>
-            </w:tcBorders>
-            <w:tcMar>
-              <w:top w:w="60" w:type="dxa"/>
-              <w:left w:w="100" w:type="dxa"/>
-              <w:bottom w:w="60" w:type="dxa"/>
-              <w:right w:w="100" w:type="dxa"/>
-            </w:tcMar>
-            <w:vAlign w:val="center"/>
-          </w:tcPr>
-          <w:p>
-            <w:pPr>
-              <w:jc w:val="center"/>
-            </w:pPr>
-            <w:r>
-              <w:t>xxx (</w:t>
-            </w:r>
-            <w:proofErr w:type="spellStart"/>
-            <w:r>
-              <w:t>xx.x</w:t>
-            </w:r>
-            <w:proofErr w:type="spellEnd"/>
-            <w:r>
-              <w:t>)</w:t>
-            </w:r>
-          </w:p>
-        </w:tc>
-        <w:tc>
-          <w:tcPr>
-            <w:tcW w:w="2340" w:type="dxa"/>
-            <w:tcBorders>
-              <w:top w:val="single" w:sz="4" w:space="0" w:color="808080"/>
-              <w:left w:val="single" w:sz="4" w:space="0" w:color="808080"/>
-              <w:bottom w:val="single" w:sz="4" w:space="0" w:color="808080"/>
-              <w:right w:val="single" w:sz="4" w:space="0" w:color="808080"/>
-            </w:tcBorders>
-            <w:tcMar>
-              <w:top w:w="60" w:type="dxa"/>
-              <w:left w:w="100" w:type="dxa"/>
-              <w:bottom w:w="60" w:type="dxa"/>
-              <w:right w:w="100" w:type="dxa"/>
-            </w:tcMar>
-            <w:vAlign w:val="center"/>
-          </w:tcPr>
-          <w:p>
-            <w:pPr>
-              <w:jc w:val="center"/>
-            </w:pPr>
-            <w:r>
-              <w:t>xxx (</w:t>
-            </w:r>
-            <w:proofErr w:type="spellStart"/>
-            <w:r>
-              <w:t>xx.x</w:t>
-            </w:r>
-            <w:proofErr w:type="spellEnd"/>
-            <w:r>
-              <w:t>)</w:t>
-            </w:r>
-          </w:p>
-        </w:tc>
-        <w:tc>
-          <w:tcPr>
-            <w:tcW w:w="2340" w:type="dxa"/>
-            <w:tcBorders>
-              <w:top w:val="single" w:sz="4" w:space="0" w:color="808080"/>
-              <w:left w:val="single" w:sz="4" w:space="0" w:color="808080"/>
-              <w:bottom w:val="single" w:sz="4" w:space="0" w:color="808080"/>
-              <w:right w:val="single" w:sz="4" w:space="0" w:color="808080"/>
-            </w:tcBorders>
-            <w:tcMar>
-              <w:top w:w="60" w:type="dxa"/>
-              <w:left w:w="100" w:type="dxa"/>
-              <w:bottom w:w="60" w:type="dxa"/>
-              <w:right w:w="100" w:type="dxa"/>
-            </w:tcMar>
-            <w:vAlign w:val="center"/>
-          </w:tcPr>
-          <w:p>
-            <w:pPr>
-              <w:jc w:val="center"/>
-            </w:pPr>
-            <w:r>
-              <w:t>xxx (</w:t>
-            </w:r>
-            <w:proofErr w:type="spellStart"/>
-            <w:r>
-              <w:t>xx.x</w:t>
-            </w:r>
-            <w:proofErr w:type="spellEnd"/>
-            <w:r>
-              <w:t>)</w:t>
-            </w:r>
-          </w:p>
-        </w:tc>
-      </w:tr>
-      <w:tr>
-        <w:tblPrEx>
-          <w:tblCellMar>
-            <w:top w:w="0" w:type="dxa"/>
-            <w:bottom w:w="0" w:type="dxa"/>
-          </w:tblCellMar>
-        </w:tblPrEx>
-        <w:tc>
-          <w:tcPr>
-            <w:tcW w:w="4680" w:type="dxa"/>
-            <w:tcBorders>
-              <w:top w:val="single" w:sz="4" w:space="0" w:color="808080"/>
-              <w:left w:val="single" w:sz="4" w:space="0" w:color="808080"/>
-              <w:bottom w:val="single" w:sz="4" w:space="0" w:color="808080"/>
-              <w:right w:val="single" w:sz="4" w:space="0" w:color="808080"/>
-            </w:tcBorders>
-            <w:tcMar>
-              <w:top w:w="60" w:type="dxa"/>
-              <w:left w:w="100" w:type="dxa"/>
-              <w:bottom w:w="60" w:type="dxa"/>
-              <w:right w:w="100" w:type="dxa"/>
-            </w:tcMar>
-            <w:vAlign w:val="center"/>
-          </w:tcPr>
-          <w:p>
-            <w:r>
-              <w:t xml:space="preserve">    </w:t>
-            </w:r>
-            <w:proofErr w:type="spellStart"/>
-            <w:r>
-              <w:t>Wk</w:t>
-            </w:r>
-            <w:proofErr w:type="spellEnd"/>
-            <w:r>
-              <w:t xml:space="preserve"> 16</w:t>
-            </w:r>
-          </w:p>
-        </w:tc>
-        <w:tc>
-          <w:tcPr>
-            <w:tcW w:w="2340" w:type="dxa"/>
-            <w:tcBorders>
-              <w:top w:val="single" w:sz="4" w:space="0" w:color="808080"/>
-              <w:left w:val="single" w:sz="4" w:space="0" w:color="808080"/>
-              <w:bottom w:val="single" w:sz="4" w:space="0" w:color="808080"/>
-              <w:right w:val="single" w:sz="4" w:space="0" w:color="808080"/>
-            </w:tcBorders>
-            <w:tcMar>
-              <w:top w:w="60" w:type="dxa"/>
-              <w:left w:w="100" w:type="dxa"/>
-              <w:bottom w:w="60" w:type="dxa"/>
-              <w:right w:w="100" w:type="dxa"/>
-            </w:tcMar>
-            <w:vAlign w:val="center"/>
-          </w:tcPr>
-          <w:p>
-            <w:pPr>
-              <w:jc w:val="center"/>
-            </w:pPr>
-            <w:r>
-              <w:t>xxx (</w:t>
-            </w:r>
-            <w:proofErr w:type="spellStart"/>
-            <w:r>
-              <w:t>xx.x</w:t>
-            </w:r>
-            <w:proofErr w:type="spellEnd"/>
-            <w:r>
-              <w:t>)</w:t>
-            </w:r>
-          </w:p>
-        </w:tc>
-        <w:tc>
-          <w:tcPr>
-            <w:tcW w:w="2340" w:type="dxa"/>
-            <w:tcBorders>
-              <w:top w:val="single" w:sz="4" w:space="0" w:color="808080"/>
-              <w:left w:val="single" w:sz="4" w:space="0" w:color="808080"/>
-              <w:bottom w:val="single" w:sz="4" w:space="0" w:color="808080"/>
-              <w:right w:val="single" w:sz="4" w:space="0" w:color="808080"/>
-            </w:tcBorders>
-            <w:tcMar>
-              <w:top w:w="60" w:type="dxa"/>
-              <w:left w:w="100" w:type="dxa"/>
-              <w:bottom w:w="60" w:type="dxa"/>
-              <w:right w:w="100" w:type="dxa"/>
-            </w:tcMar>
-            <w:vAlign w:val="center"/>
-          </w:tcPr>
-          <w:p>
-            <w:pPr>
-              <w:jc w:val="center"/>
-            </w:pPr>
-            <w:r>
-              <w:t>xxx (</w:t>
-            </w:r>
-            <w:proofErr w:type="spellStart"/>
-            <w:r>
-              <w:t>xx.x</w:t>
-            </w:r>
-            <w:proofErr w:type="spellEnd"/>
-            <w:r>
-              <w:t>)</w:t>
-            </w:r>
-          </w:p>
-        </w:tc>
-        <w:tc>
-          <w:tcPr>
-            <w:tcW w:w="2340" w:type="dxa"/>
-            <w:tcBorders>
-              <w:top w:val="single" w:sz="4" w:space="0" w:color="808080"/>
-              <w:left w:val="single" w:sz="4" w:space="0" w:color="808080"/>
-              <w:bottom w:val="single" w:sz="4" w:space="0" w:color="808080"/>
-              <w:right w:val="single" w:sz="4" w:space="0" w:color="808080"/>
-            </w:tcBorders>
-            <w:tcMar>
-              <w:top w:w="60" w:type="dxa"/>
-              <w:left w:w="100" w:type="dxa"/>
-              <w:bottom w:w="60" w:type="dxa"/>
-              <w:right w:w="100" w:type="dxa"/>
-            </w:tcMar>
-            <w:vAlign w:val="center"/>
-          </w:tcPr>
-          <w:p>
-            <w:pPr>
-              <w:jc w:val="center"/>
-            </w:pPr>
-            <w:r>
-              <w:t>xxx (</w:t>
-            </w:r>
-            <w:proofErr w:type="spellStart"/>
-            <w:r>
-              <w:t>xx.x</w:t>
-            </w:r>
-            <w:proofErr w:type="spellEnd"/>
-            <w:r>
-              <w:t>)</w:t>
-            </w:r>
-          </w:p>
-        </w:tc>
-      </w:tr>
-      <w:tr>
-        <w:tblPrEx>
-          <w:tblCellMar>
-            <w:top w:w="0" w:type="dxa"/>
-            <w:bottom w:w="0" w:type="dxa"/>
-          </w:tblCellMar>
-        </w:tblPrEx>
-        <w:tc>
-          <w:tcPr>
-            <w:tcW w:w="4680" w:type="dxa"/>
-            <w:tcBorders>
-              <w:top w:val="single" w:sz="4" w:space="0" w:color="808080"/>
-              <w:left w:val="single" w:sz="4" w:space="0" w:color="808080"/>
-              <w:bottom w:val="single" w:sz="4" w:space="0" w:color="808080"/>
-              <w:right w:val="single" w:sz="4" w:space="0" w:color="808080"/>
-            </w:tcBorders>
-            <w:tcMar>
-              <w:top w:w="60" w:type="dxa"/>
-              <w:left w:w="100" w:type="dxa"/>
-              <w:bottom w:w="60" w:type="dxa"/>
-              <w:right w:w="100" w:type="dxa"/>
-            </w:tcMar>
-            <w:vAlign w:val="center"/>
-          </w:tcPr>
-          <w:p>
-            <w:r>
-              <w:t xml:space="preserve">    </w:t>
-            </w:r>
-            <w:proofErr w:type="spellStart"/>
-            <w:r>
-              <w:t>Wk</w:t>
-            </w:r>
-            <w:proofErr w:type="spellEnd"/>
-            <w:r>
-              <w:t xml:space="preserve"> 52</w:t>
-            </w:r>
-          </w:p>
-        </w:tc>
-        <w:tc>
-          <w:tcPr>
-            <w:tcW w:w="2340" w:type="dxa"/>
-            <w:tcBorders>
-              <w:top w:val="single" w:sz="4" w:space="0" w:color="808080"/>
-              <w:left w:val="single" w:sz="4" w:space="0" w:color="808080"/>
-              <w:bottom w:val="single" w:sz="4" w:space="0" w:color="808080"/>
-              <w:right w:val="single" w:sz="4" w:space="0" w:color="808080"/>
-            </w:tcBorders>
-            <w:tcMar>
-              <w:top w:w="60" w:type="dxa"/>
-              <w:left w:w="100" w:type="dxa"/>
-              <w:bottom w:w="60" w:type="dxa"/>
-              <w:right w:w="100" w:type="dxa"/>
-            </w:tcMar>
-            <w:vAlign w:val="center"/>
-          </w:tcPr>
-          <w:p>
-            <w:pPr>
-              <w:jc w:val="center"/>
-            </w:pPr>
-            <w:r>
-              <w:t>xxx (</w:t>
-            </w:r>
-            <w:proofErr w:type="spellStart"/>
-            <w:r>
-              <w:t>xx.x</w:t>
-            </w:r>
-            <w:proofErr w:type="spellEnd"/>
-            <w:r>
-              <w:t>)</w:t>
-            </w:r>
-          </w:p>
-        </w:tc>
-        <w:tc>
-          <w:tcPr>
-            <w:tcW w:w="2340" w:type="dxa"/>
-            <w:tcBorders>
-              <w:top w:val="single" w:sz="4" w:space="0" w:color="808080"/>
-              <w:left w:val="single" w:sz="4" w:space="0" w:color="808080"/>
-              <w:bottom w:val="single" w:sz="4" w:space="0" w:color="808080"/>
-              <w:right w:val="single" w:sz="4" w:space="0" w:color="808080"/>
-            </w:tcBorders>
-            <w:tcMar>
-              <w:top w:w="60" w:type="dxa"/>
-              <w:left w:w="100" w:type="dxa"/>
-              <w:bottom w:w="60" w:type="dxa"/>
-              <w:right w:w="100" w:type="dxa"/>
-            </w:tcMar>
-            <w:vAlign w:val="center"/>
-          </w:tcPr>
-          <w:p>
-            <w:pPr>
-              <w:jc w:val="center"/>
-            </w:pPr>
-            <w:r>
-              <w:t>xxx (</w:t>
-            </w:r>
-            <w:proofErr w:type="spellStart"/>
-            <w:r>
-              <w:t>xx.x</w:t>
-            </w:r>
-            <w:proofErr w:type="spellEnd"/>
-            <w:r>
-              <w:t>)</w:t>
-            </w:r>
-          </w:p>
-        </w:tc>
-        <w:tc>
-          <w:tcPr>
-            <w:tcW w:w="2340" w:type="dxa"/>
-            <w:tcBorders>
-              <w:top w:val="single" w:sz="4" w:space="0" w:color="808080"/>
-              <w:left w:val="single" w:sz="4" w:space="0" w:color="808080"/>
-              <w:bottom w:val="single" w:sz="4" w:space="0" w:color="808080"/>
-              <w:right w:val="single" w:sz="4" w:space="0" w:color="808080"/>
-            </w:tcBorders>
-            <w:tcMar>
-              <w:top w:w="60" w:type="dxa"/>
-              <w:left w:w="100" w:type="dxa"/>
-              <w:bottom w:w="60" w:type="dxa"/>
-              <w:right w:w="100" w:type="dxa"/>
-            </w:tcMar>
-            <w:vAlign w:val="center"/>
-          </w:tcPr>
-          <w:p>
-            <w:pPr>
-              <w:jc w:val="center"/>
-            </w:pPr>
-            <w:r>
-              <w:t>xxx (</w:t>
-            </w:r>
-            <w:proofErr w:type="spellStart"/>
-            <w:r>
-              <w:t>xx.x</w:t>
-            </w:r>
-            <w:proofErr w:type="spellEnd"/>
-            <w:r>
-              <w:t>)</w:t>
-            </w:r>
-          </w:p>
-        </w:tc>
-      </w:tr>
-      <w:tr>
-        <w:tblPrEx>
-          <w:tblCellMar>
-            <w:top w:w="0" w:type="dxa"/>
-            <w:bottom w:w="0" w:type="dxa"/>
-          </w:tblCellMar>
-        </w:tblPrEx>
-        <w:tc>
-          <w:tcPr>
-            <w:tcW w:w="4680" w:type="dxa"/>
-            <w:tcBorders>
-              <w:top w:val="single" w:sz="4" w:space="0" w:color="808080"/>
-              <w:left w:val="single" w:sz="4" w:space="0" w:color="808080"/>
-              <w:bottom w:val="single" w:sz="4" w:space="0" w:color="808080"/>
-              <w:right w:val="single" w:sz="4" w:space="0" w:color="808080"/>
-            </w:tcBorders>
-            <w:tcMar>
-              <w:top w:w="60" w:type="dxa"/>
-              <w:left w:w="100" w:type="dxa"/>
-              <w:bottom w:w="60" w:type="dxa"/>
-              <w:right w:w="100" w:type="dxa"/>
-            </w:tcMar>
-            <w:vAlign w:val="center"/>
-          </w:tcPr>
-          <w:p>
-            <w:r>
-              <w:t xml:space="preserve">    </w:t>
-            </w:r>
-            <w:proofErr w:type="spellStart"/>
-            <w:r>
-              <w:t>Wk</w:t>
-            </w:r>
-            <w:proofErr w:type="spellEnd"/>
-            <w:r>
-              <w:t xml:space="preserve"> 104</w:t>
-            </w:r>
-          </w:p>
-        </w:tc>
-        <w:tc>
-          <w:tcPr>
-            <w:tcW w:w="2340" w:type="dxa"/>
-            <w:tcBorders>
-              <w:top w:val="single" w:sz="4" w:space="0" w:color="808080"/>
-              <w:left w:val="single" w:sz="4" w:space="0" w:color="808080"/>
-              <w:bottom w:val="single" w:sz="4" w:space="0" w:color="808080"/>
-              <w:right w:val="single" w:sz="4" w:space="0" w:color="808080"/>
-            </w:tcBorders>
-            <w:tcMar>
-              <w:top w:w="60" w:type="dxa"/>
-              <w:left w:w="100" w:type="dxa"/>
-              <w:bottom w:w="60" w:type="dxa"/>
-              <w:right w:w="100" w:type="dxa"/>
-            </w:tcMar>
-            <w:vAlign w:val="center"/>
-          </w:tcPr>
-          <w:p>
-            <w:pPr>
-              <w:jc w:val="center"/>
-            </w:pPr>
-            <w:r>
-              <w:t>xxx (</w:t>
-            </w:r>
-            <w:proofErr w:type="spellStart"/>
-            <w:r>
-              <w:t>xx.x</w:t>
-            </w:r>
-            <w:proofErr w:type="spellEnd"/>
-            <w:r>
-              <w:t>)</w:t>
-            </w:r>
-          </w:p>
-        </w:tc>
-        <w:tc>
-          <w:tcPr>
-            <w:tcW w:w="2340" w:type="dxa"/>
-            <w:tcBorders>
-              <w:top w:val="single" w:sz="4" w:space="0" w:color="808080"/>
-              <w:left w:val="single" w:sz="4" w:space="0" w:color="808080"/>
-              <w:bottom w:val="single" w:sz="4" w:space="0" w:color="808080"/>
-              <w:right w:val="single" w:sz="4" w:space="0" w:color="808080"/>
-            </w:tcBorders>
-            <w:tcMar>
-              <w:top w:w="60" w:type="dxa"/>
-              <w:left w:w="100" w:type="dxa"/>
-              <w:bottom w:w="60" w:type="dxa"/>
-              <w:right w:w="100" w:type="dxa"/>
-            </w:tcMar>
-            <w:vAlign w:val="center"/>
-          </w:tcPr>
-          <w:p>
-            <w:pPr>
-              <w:jc w:val="center"/>
-            </w:pPr>
-            <w:r>
-              <w:t>xxx (</w:t>
-            </w:r>
-            <w:proofErr w:type="spellStart"/>
-            <w:r>
-              <w:t>xx.x</w:t>
-            </w:r>
-            <w:proofErr w:type="spellEnd"/>
-            <w:r>
-              <w:t>)</w:t>
-            </w:r>
-          </w:p>
-        </w:tc>
-        <w:tc>
-          <w:tcPr>
-            <w:tcW w:w="2340" w:type="dxa"/>
-            <w:tcBorders>
-              <w:top w:val="single" w:sz="4" w:space="0" w:color="808080"/>
-              <w:left w:val="single" w:sz="4" w:space="0" w:color="808080"/>
-              <w:bottom w:val="single" w:sz="4" w:space="0" w:color="808080"/>
-              <w:right w:val="single" w:sz="4" w:space="0" w:color="808080"/>
-            </w:tcBorders>
-            <w:tcMar>
-              <w:top w:w="60" w:type="dxa"/>
-              <w:left w:w="100" w:type="dxa"/>
-              <w:bottom w:w="60" w:type="dxa"/>
-              <w:right w:w="100" w:type="dxa"/>
-            </w:tcMar>
-            <w:vAlign w:val="center"/>
-          </w:tcPr>
-          <w:p>
-            <w:pPr>
-              <w:jc w:val="center"/>
-            </w:pPr>
-            <w:r>
-              <w:t>xxx (</w:t>
-            </w:r>
-            <w:proofErr w:type="spellStart"/>
-            <w:r>
-              <w:t>xx.x</w:t>
-            </w:r>
-            <w:proofErr w:type="spellEnd"/>
-            <w:r>
-              <w:t>)</w:t>
-            </w:r>
-          </w:p>
-        </w:tc>
-      </w:tr>
-      <w:tr>
-        <w:tblPrEx>
-          <w:tblCellMar>
-            <w:top w:w="0" w:type="dxa"/>
-            <w:bottom w:w="0" w:type="dxa"/>
-          </w:tblCellMar>
-        </w:tblPrEx>
-        <w:tc>
-          <w:tcPr>
-            <w:tcW w:w="4680" w:type="dxa"/>
-            <w:tcBorders>
-              <w:top w:val="single" w:sz="4" w:space="0" w:color="808080"/>
-              <w:left w:val="single" w:sz="4" w:space="0" w:color="808080"/>
-              <w:bottom w:val="single" w:sz="4" w:space="0" w:color="808080"/>
-              <w:right w:val="single" w:sz="4" w:space="0" w:color="808080"/>
-            </w:tcBorders>
-            <w:tcMar>
-              <w:top w:w="60" w:type="dxa"/>
-              <w:left w:w="100" w:type="dxa"/>
-              <w:bottom w:w="60" w:type="dxa"/>
-              <w:right w:w="100" w:type="dxa"/>
-            </w:tcMar>
-            <w:vAlign w:val="center"/>
-          </w:tcPr>
-          <w:p>
-            <w:r>
-              <w:t xml:space="preserve">    </w:t>
-            </w:r>
-            <w:proofErr w:type="spellStart"/>
-            <w:r>
-              <w:t>Wk</w:t>
-            </w:r>
-            <w:proofErr w:type="spellEnd"/>
-            <w:r>
-              <w:t xml:space="preserve"> 140</w:t>
             </w:r>
           </w:p>
         </w:tc>

</xml_diff>